<commit_message>
correcciones del profe 2
</commit_message>
<xml_diff>
--- a/PROYECTO_BD_GRUPO_CINCO.docx
+++ b/PROYECTO_BD_GRUPO_CINCO.docx
@@ -474,21 +474,9 @@
           <w:iCs/>
           <w:color w:val="FF0000"/>
         </w:rPr>
-        <w:t>Nike Direct (Digital Commerce &amp; Retail)</w:t>
-      </w:r>
-      <w:r>
-        <w:rPr>
-          <w:rFonts w:ascii="Arial" w:hAnsi="Arial" w:cs="Arial"/>
-          <w:color w:val="FF0000"/>
-        </w:rPr>
-        <w:t xml:space="preserve"> </w:t>
-      </w:r>
-      <w:r>
-        <w:rPr>
-          <w:rFonts w:ascii="Arial" w:hAnsi="Arial" w:cs="Arial"/>
-        </w:rPr>
-        <w:t xml:space="preserve">y </w:t>
-      </w:r>
+        <w:t xml:space="preserve">Nike Direct (Digital Commerce &amp; </w:t>
+      </w:r>
+      <w:proofErr w:type="spellStart"/>
       <w:r>
         <w:rPr>
           <w:rFonts w:ascii="Arial" w:hAnsi="Arial" w:cs="Arial"/>
@@ -496,8 +484,91 @@
           <w:iCs/>
           <w:color w:val="FF0000"/>
         </w:rPr>
-        <w:t>Global Supply Chain &amp; Operations</w:t>
-      </w:r>
+        <w:t>Retail</w:t>
+      </w:r>
+      <w:proofErr w:type="spellEnd"/>
+      <w:r>
+        <w:rPr>
+          <w:rFonts w:ascii="Arial" w:hAnsi="Arial" w:cs="Arial"/>
+          <w:i/>
+          <w:iCs/>
+          <w:color w:val="FF0000"/>
+        </w:rPr>
+        <w:t>)</w:t>
+      </w:r>
+      <w:r>
+        <w:rPr>
+          <w:rFonts w:ascii="Arial" w:hAnsi="Arial" w:cs="Arial"/>
+          <w:color w:val="FF0000"/>
+        </w:rPr>
+        <w:t xml:space="preserve"> </w:t>
+      </w:r>
+      <w:r>
+        <w:rPr>
+          <w:rFonts w:ascii="Arial" w:hAnsi="Arial" w:cs="Arial"/>
+        </w:rPr>
+        <w:t xml:space="preserve">y </w:t>
+      </w:r>
+      <w:r>
+        <w:rPr>
+          <w:rFonts w:ascii="Arial" w:hAnsi="Arial" w:cs="Arial"/>
+          <w:i/>
+          <w:iCs/>
+          <w:color w:val="FF0000"/>
+        </w:rPr>
+        <w:t xml:space="preserve">Global </w:t>
+      </w:r>
+      <w:proofErr w:type="spellStart"/>
+      <w:r>
+        <w:rPr>
+          <w:rFonts w:ascii="Arial" w:hAnsi="Arial" w:cs="Arial"/>
+          <w:i/>
+          <w:iCs/>
+          <w:color w:val="FF0000"/>
+        </w:rPr>
+        <w:t>Supply</w:t>
+      </w:r>
+      <w:proofErr w:type="spellEnd"/>
+      <w:r>
+        <w:rPr>
+          <w:rFonts w:ascii="Arial" w:hAnsi="Arial" w:cs="Arial"/>
+          <w:i/>
+          <w:iCs/>
+          <w:color w:val="FF0000"/>
+        </w:rPr>
+        <w:t xml:space="preserve"> </w:t>
+      </w:r>
+      <w:proofErr w:type="spellStart"/>
+      <w:r>
+        <w:rPr>
+          <w:rFonts w:ascii="Arial" w:hAnsi="Arial" w:cs="Arial"/>
+          <w:i/>
+          <w:iCs/>
+          <w:color w:val="FF0000"/>
+        </w:rPr>
+        <w:t>Chain</w:t>
+      </w:r>
+      <w:proofErr w:type="spellEnd"/>
+      <w:r>
+        <w:rPr>
+          <w:rFonts w:ascii="Arial" w:hAnsi="Arial" w:cs="Arial"/>
+          <w:i/>
+          <w:iCs/>
+          <w:color w:val="FF0000"/>
+        </w:rPr>
+        <w:t xml:space="preserve"> &amp; </w:t>
+      </w:r>
+      <w:proofErr w:type="spellStart"/>
+      <w:r>
+        <w:rPr>
+          <w:rFonts w:ascii="Arial" w:hAnsi="Arial" w:cs="Arial"/>
+          <w:i/>
+          <w:iCs/>
+          <w:color w:val="FF0000"/>
+        </w:rPr>
+        <w:t>Operations</w:t>
+      </w:r>
+      <w:proofErr w:type="spellEnd"/>
       <w:r>
         <w:rPr>
           <w:rFonts w:ascii="Arial" w:hAnsi="Arial" w:cs="Arial"/>
@@ -606,8 +677,16 @@
         <w:rPr>
           <w:rFonts w:ascii="Arial" w:hAnsi="Arial" w:cs="Arial"/>
         </w:rPr>
-        <w:t>stock, etc</w:t>
-      </w:r>
+        <w:t xml:space="preserve">stock, </w:t>
+      </w:r>
+      <w:proofErr w:type="spellStart"/>
+      <w:r>
+        <w:rPr>
+          <w:rFonts w:ascii="Arial" w:hAnsi="Arial" w:cs="Arial"/>
+        </w:rPr>
+        <w:t>etc</w:t>
+      </w:r>
+      <w:proofErr w:type="spellEnd"/>
       <w:r>
         <w:rPr>
           <w:rFonts w:ascii="Arial" w:hAnsi="Arial" w:cs="Arial"/>
@@ -1944,11 +2023,14 @@
       <w:r>
         <w:rPr>
           <w:rFonts w:ascii="Arial" w:hAnsi="Arial" w:cs="Arial"/>
+          <w:b/>
+          <w:bCs/>
           <w:noProof/>
+          <w:color w:val="0C3512" w:themeColor="accent3" w:themeShade="80"/>
         </w:rPr>
         <w:lastRenderedPageBreak/>
         <w:drawing>
-          <wp:anchor distT="0" distB="0" distL="114300" distR="114300" simplePos="0" relativeHeight="251673600" behindDoc="0" locked="0" layoutInCell="1" allowOverlap="1" wp14:anchorId="3753DB00" wp14:editId="193A3F1D">
+          <wp:anchor distT="0" distB="0" distL="114300" distR="114300" simplePos="0" relativeHeight="251677696" behindDoc="0" locked="0" layoutInCell="1" allowOverlap="1" wp14:anchorId="3FD47A43" wp14:editId="08106133">
             <wp:simplePos x="0" y="0"/>
             <wp:positionH relativeFrom="column">
               <wp:posOffset>0</wp:posOffset>
@@ -1956,10 +2038,10 @@
             <wp:positionV relativeFrom="paragraph">
               <wp:posOffset>228600</wp:posOffset>
             </wp:positionV>
-            <wp:extent cx="9777730" cy="6267450"/>
+            <wp:extent cx="9715500" cy="6619765"/>
             <wp:effectExtent l="0" t="0" r="0" b="0"/>
             <wp:wrapNone/>
-            <wp:docPr id="3" name="Imagen 3"/>
+            <wp:docPr id="6" name="Imagen 6"/>
             <wp:cNvGraphicFramePr>
               <a:graphicFrameLocks xmlns:a="http://schemas.openxmlformats.org/drawingml/2006/main" noChangeAspect="1"/>
             </wp:cNvGraphicFramePr>
@@ -1967,7 +2049,7 @@
               <a:graphicData uri="http://schemas.openxmlformats.org/drawingml/2006/picture">
                 <pic:pic xmlns:pic="http://schemas.openxmlformats.org/drawingml/2006/picture">
                   <pic:nvPicPr>
-                    <pic:cNvPr id="0" name="Picture 1"/>
+                    <pic:cNvPr id="0" name="Picture 3"/>
                     <pic:cNvPicPr>
                       <a:picLocks noChangeAspect="1" noChangeArrowheads="1"/>
                     </pic:cNvPicPr>
@@ -1988,7 +2070,7 @@
                   <pic:spPr bwMode="auto">
                     <a:xfrm>
                       <a:off x="0" y="0"/>
-                      <a:ext cx="9777730" cy="6267450"/>
+                      <a:ext cx="9719674" cy="6622609"/>
                     </a:xfrm>
                     <a:prstGeom prst="rect">
                       <a:avLst/>
@@ -2018,6 +2100,15 @@
           <w:color w:val="0C3512" w:themeColor="accent3" w:themeShade="80"/>
         </w:rPr>
         <w:t>6. Modelo Físico (DIAGRAMA)</w:t>
+      </w:r>
+      <w:r>
+        <w:rPr>
+          <w:rFonts w:ascii="Arial" w:hAnsi="Arial" w:cs="Arial"/>
+          <w:b/>
+          <w:bCs/>
+          <w:color w:val="0C3512" w:themeColor="accent3" w:themeShade="80"/>
+        </w:rPr>
+        <w:t xml:space="preserve"> </w:t>
       </w:r>
     </w:p>
     <w:p>

</xml_diff>

<commit_message>
añadidos de diccionarios y guias
</commit_message>
<xml_diff>
--- a/PROYECTO_BD_GRUPO_CINCO.docx
+++ b/PROYECTO_BD_GRUPO_CINCO.docx
@@ -799,18 +799,18 @@
         </w:rPr>
         <w:lastRenderedPageBreak/>
         <w:drawing>
-          <wp:anchor distT="0" distB="0" distL="114300" distR="114300" simplePos="0" relativeHeight="251676672" behindDoc="0" locked="0" layoutInCell="1" allowOverlap="1" wp14:anchorId="18A3E02A" wp14:editId="1D7EAE19">
+          <wp:anchor distT="0" distB="0" distL="114300" distR="114300" simplePos="0" relativeHeight="251680768" behindDoc="0" locked="0" layoutInCell="1" allowOverlap="1" wp14:anchorId="1C6D0E29" wp14:editId="5ECD7F09">
             <wp:simplePos x="0" y="0"/>
             <wp:positionH relativeFrom="column">
               <wp:posOffset>0</wp:posOffset>
             </wp:positionH>
             <wp:positionV relativeFrom="paragraph">
-              <wp:posOffset>220717</wp:posOffset>
+              <wp:posOffset>228600</wp:posOffset>
             </wp:positionV>
-            <wp:extent cx="9715500" cy="6326146"/>
+            <wp:extent cx="9772650" cy="6629400"/>
             <wp:effectExtent l="0" t="0" r="0" b="0"/>
             <wp:wrapNone/>
-            <wp:docPr id="10" name="Imagen 10"/>
+            <wp:docPr id="12" name="Imagen 12"/>
             <wp:cNvGraphicFramePr>
               <a:graphicFrameLocks xmlns:a="http://schemas.openxmlformats.org/drawingml/2006/main" noChangeAspect="1"/>
             </wp:cNvGraphicFramePr>
@@ -839,7 +839,7 @@
                   <pic:spPr bwMode="auto">
                     <a:xfrm>
                       <a:off x="0" y="0"/>
-                      <a:ext cx="9722723" cy="6330849"/>
+                      <a:ext cx="9772650" cy="6629400"/>
                     </a:xfrm>
                     <a:prstGeom prst="rect">
                       <a:avLst/>
@@ -1110,22 +1110,320 @@
       </w:pPr>
       <w:r>
         <w:rPr>
+          <w:rFonts w:ascii="Arial" w:hAnsi="Arial" w:cs="Arial"/>
+          <w:b/>
+          <w:bCs/>
+          <w:color w:val="0C3512" w:themeColor="accent3" w:themeShade="80"/>
+        </w:rPr>
+        <w:lastRenderedPageBreak/>
+        <w:t>4. Modelo Lógico</w:t>
+      </w:r>
+    </w:p>
+    <w:p>
+      <w:pPr>
+        <w:tabs>
+          <w:tab w:val="left" w:pos="3165"/>
+        </w:tabs>
+        <w:rPr>
+          <w:rFonts w:ascii="Arial" w:hAnsi="Arial" w:cs="Arial"/>
+        </w:rPr>
+      </w:pPr>
+      <w:r>
+        <w:rPr>
+          <w:rFonts w:ascii="Arial" w:hAnsi="Arial" w:cs="Arial"/>
+          <w:noProof/>
+        </w:rPr>
+        <w:drawing>
+          <wp:anchor distT="0" distB="0" distL="114300" distR="114300" simplePos="0" relativeHeight="251679744" behindDoc="0" locked="0" layoutInCell="1" allowOverlap="1" wp14:anchorId="6BEA02B4" wp14:editId="7290DA36">
+            <wp:simplePos x="0" y="0"/>
+            <wp:positionH relativeFrom="column">
+              <wp:posOffset>0</wp:posOffset>
+            </wp:positionH>
+            <wp:positionV relativeFrom="paragraph">
+              <wp:posOffset>9525</wp:posOffset>
+            </wp:positionV>
+            <wp:extent cx="9715500" cy="6427470"/>
+            <wp:effectExtent l="0" t="0" r="0" b="0"/>
+            <wp:wrapNone/>
+            <wp:docPr id="11" name="Imagen 11"/>
+            <wp:cNvGraphicFramePr>
+              <a:graphicFrameLocks xmlns:a="http://schemas.openxmlformats.org/drawingml/2006/main" noChangeAspect="1"/>
+            </wp:cNvGraphicFramePr>
+            <a:graphic xmlns:a="http://schemas.openxmlformats.org/drawingml/2006/main">
+              <a:graphicData uri="http://schemas.openxmlformats.org/drawingml/2006/picture">
+                <pic:pic xmlns:pic="http://schemas.openxmlformats.org/drawingml/2006/picture">
+                  <pic:nvPicPr>
+                    <pic:cNvPr id="0" name="Picture 5"/>
+                    <pic:cNvPicPr>
+                      <a:picLocks noChangeAspect="1" noChangeArrowheads="1"/>
+                    </pic:cNvPicPr>
+                  </pic:nvPicPr>
+                  <pic:blipFill>
+                    <a:blip r:embed="rId9" cstate="print">
+                      <a:extLst>
+                        <a:ext uri="{28A0092B-C50C-407E-A947-70E740481C1C}">
+                          <a14:useLocalDpi xmlns:a14="http://schemas.microsoft.com/office/drawing/2010/main" val="0"/>
+                        </a:ext>
+                      </a:extLst>
+                    </a:blip>
+                    <a:srcRect/>
+                    <a:stretch>
+                      <a:fillRect/>
+                    </a:stretch>
+                  </pic:blipFill>
+                  <pic:spPr bwMode="auto">
+                    <a:xfrm>
+                      <a:off x="0" y="0"/>
+                      <a:ext cx="9716147" cy="6427898"/>
+                    </a:xfrm>
+                    <a:prstGeom prst="rect">
+                      <a:avLst/>
+                    </a:prstGeom>
+                    <a:noFill/>
+                    <a:ln>
+                      <a:noFill/>
+                    </a:ln>
+                  </pic:spPr>
+                </pic:pic>
+              </a:graphicData>
+            </a:graphic>
+            <wp14:sizeRelH relativeFrom="page">
+              <wp14:pctWidth>0</wp14:pctWidth>
+            </wp14:sizeRelH>
+            <wp14:sizeRelV relativeFrom="page">
+              <wp14:pctHeight>0</wp14:pctHeight>
+            </wp14:sizeRelV>
+          </wp:anchor>
+        </w:drawing>
+      </w:r>
+    </w:p>
+    <w:p>
+      <w:pPr>
+        <w:tabs>
+          <w:tab w:val="left" w:pos="3165"/>
+        </w:tabs>
+        <w:rPr>
+          <w:rFonts w:ascii="Arial" w:hAnsi="Arial" w:cs="Arial"/>
+        </w:rPr>
+      </w:pPr>
+    </w:p>
+    <w:p>
+      <w:pPr>
+        <w:tabs>
+          <w:tab w:val="left" w:pos="3165"/>
+        </w:tabs>
+        <w:rPr>
+          <w:rFonts w:ascii="Arial" w:hAnsi="Arial" w:cs="Arial"/>
+        </w:rPr>
+      </w:pPr>
+    </w:p>
+    <w:p>
+      <w:pPr>
+        <w:tabs>
+          <w:tab w:val="left" w:pos="3165"/>
+        </w:tabs>
+        <w:rPr>
+          <w:rFonts w:ascii="Arial" w:hAnsi="Arial" w:cs="Arial"/>
+        </w:rPr>
+      </w:pPr>
+    </w:p>
+    <w:p>
+      <w:pPr>
+        <w:tabs>
+          <w:tab w:val="left" w:pos="3165"/>
+        </w:tabs>
+        <w:rPr>
+          <w:rFonts w:ascii="Arial" w:hAnsi="Arial" w:cs="Arial"/>
+        </w:rPr>
+      </w:pPr>
+    </w:p>
+    <w:p>
+      <w:pPr>
+        <w:tabs>
+          <w:tab w:val="left" w:pos="3165"/>
+        </w:tabs>
+        <w:rPr>
+          <w:rFonts w:ascii="Arial" w:hAnsi="Arial" w:cs="Arial"/>
+        </w:rPr>
+      </w:pPr>
+    </w:p>
+    <w:p>
+      <w:pPr>
+        <w:tabs>
+          <w:tab w:val="left" w:pos="3165"/>
+        </w:tabs>
+        <w:rPr>
+          <w:rFonts w:ascii="Arial" w:hAnsi="Arial" w:cs="Arial"/>
+        </w:rPr>
+      </w:pPr>
+    </w:p>
+    <w:p>
+      <w:pPr>
+        <w:tabs>
+          <w:tab w:val="left" w:pos="3165"/>
+        </w:tabs>
+        <w:rPr>
+          <w:rFonts w:ascii="Arial" w:hAnsi="Arial" w:cs="Arial"/>
+        </w:rPr>
+      </w:pPr>
+    </w:p>
+    <w:p>
+      <w:pPr>
+        <w:tabs>
+          <w:tab w:val="left" w:pos="3165"/>
+        </w:tabs>
+        <w:rPr>
+          <w:rFonts w:ascii="Arial" w:hAnsi="Arial" w:cs="Arial"/>
+        </w:rPr>
+      </w:pPr>
+    </w:p>
+    <w:p>
+      <w:pPr>
+        <w:tabs>
+          <w:tab w:val="left" w:pos="3165"/>
+        </w:tabs>
+        <w:rPr>
+          <w:rFonts w:ascii="Arial" w:hAnsi="Arial" w:cs="Arial"/>
+        </w:rPr>
+      </w:pPr>
+    </w:p>
+    <w:p>
+      <w:pPr>
+        <w:tabs>
+          <w:tab w:val="left" w:pos="3165"/>
+        </w:tabs>
+        <w:rPr>
+          <w:rFonts w:ascii="Arial" w:hAnsi="Arial" w:cs="Arial"/>
+        </w:rPr>
+      </w:pPr>
+    </w:p>
+    <w:p>
+      <w:pPr>
+        <w:tabs>
+          <w:tab w:val="left" w:pos="3165"/>
+        </w:tabs>
+        <w:rPr>
+          <w:rFonts w:ascii="Arial" w:hAnsi="Arial" w:cs="Arial"/>
+        </w:rPr>
+      </w:pPr>
+    </w:p>
+    <w:p>
+      <w:pPr>
+        <w:tabs>
+          <w:tab w:val="left" w:pos="3165"/>
+        </w:tabs>
+        <w:rPr>
+          <w:rFonts w:ascii="Arial" w:hAnsi="Arial" w:cs="Arial"/>
+        </w:rPr>
+      </w:pPr>
+    </w:p>
+    <w:p>
+      <w:pPr>
+        <w:tabs>
+          <w:tab w:val="left" w:pos="3165"/>
+        </w:tabs>
+        <w:rPr>
+          <w:rFonts w:ascii="Arial" w:hAnsi="Arial" w:cs="Arial"/>
+        </w:rPr>
+      </w:pPr>
+    </w:p>
+    <w:p>
+      <w:pPr>
+        <w:tabs>
+          <w:tab w:val="left" w:pos="3165"/>
+        </w:tabs>
+        <w:rPr>
+          <w:rFonts w:ascii="Arial" w:hAnsi="Arial" w:cs="Arial"/>
+        </w:rPr>
+      </w:pPr>
+    </w:p>
+    <w:p>
+      <w:pPr>
+        <w:tabs>
+          <w:tab w:val="left" w:pos="3165"/>
+        </w:tabs>
+        <w:rPr>
+          <w:rFonts w:ascii="Arial" w:hAnsi="Arial" w:cs="Arial"/>
+        </w:rPr>
+      </w:pPr>
+    </w:p>
+    <w:p>
+      <w:pPr>
+        <w:tabs>
+          <w:tab w:val="left" w:pos="3165"/>
+        </w:tabs>
+        <w:rPr>
+          <w:rFonts w:ascii="Arial" w:hAnsi="Arial" w:cs="Arial"/>
+        </w:rPr>
+      </w:pPr>
+    </w:p>
+    <w:p>
+      <w:pPr>
+        <w:tabs>
+          <w:tab w:val="left" w:pos="3165"/>
+        </w:tabs>
+        <w:rPr>
+          <w:rFonts w:ascii="Arial" w:hAnsi="Arial" w:cs="Arial"/>
+        </w:rPr>
+      </w:pPr>
+    </w:p>
+    <w:p>
+      <w:pPr>
+        <w:tabs>
+          <w:tab w:val="left" w:pos="3165"/>
+        </w:tabs>
+        <w:rPr>
+          <w:rFonts w:ascii="Arial" w:hAnsi="Arial" w:cs="Arial"/>
+        </w:rPr>
+      </w:pPr>
+    </w:p>
+    <w:p>
+      <w:pPr>
+        <w:tabs>
+          <w:tab w:val="left" w:pos="3165"/>
+        </w:tabs>
+        <w:rPr>
+          <w:rFonts w:ascii="Arial" w:hAnsi="Arial" w:cs="Arial"/>
+        </w:rPr>
+      </w:pPr>
+    </w:p>
+    <w:p>
+      <w:pPr>
+        <w:tabs>
+          <w:tab w:val="left" w:pos="3165"/>
+        </w:tabs>
+        <w:rPr>
+          <w:rFonts w:ascii="Arial" w:hAnsi="Arial" w:cs="Arial"/>
+        </w:rPr>
+      </w:pPr>
+    </w:p>
+    <w:p>
+      <w:pPr>
+        <w:tabs>
+          <w:tab w:val="left" w:pos="3165"/>
+        </w:tabs>
+        <w:rPr>
+          <w:rFonts w:ascii="Arial" w:hAnsi="Arial" w:cs="Arial"/>
+        </w:rPr>
+      </w:pPr>
+      <w:r>
+        <w:rPr>
           <w:noProof/>
         </w:rPr>
         <w:lastRenderedPageBreak/>
         <w:drawing>
-          <wp:anchor distT="0" distB="0" distL="114300" distR="114300" simplePos="0" relativeHeight="251675648" behindDoc="0" locked="0" layoutInCell="1" allowOverlap="1" wp14:anchorId="3443BDE0" wp14:editId="35846E60">
+          <wp:anchor distT="0" distB="0" distL="114300" distR="114300" simplePos="0" relativeHeight="251678720" behindDoc="0" locked="0" layoutInCell="1" allowOverlap="1" wp14:anchorId="7EFF30CD" wp14:editId="0C8F5A88">
             <wp:simplePos x="0" y="0"/>
             <wp:positionH relativeFrom="column">
-              <wp:posOffset>5938</wp:posOffset>
+              <wp:posOffset>0</wp:posOffset>
             </wp:positionH>
             <wp:positionV relativeFrom="paragraph">
-              <wp:posOffset>267195</wp:posOffset>
+              <wp:posOffset>228600</wp:posOffset>
             </wp:positionV>
-            <wp:extent cx="9630888" cy="6386195"/>
-            <wp:effectExtent l="0" t="0" r="8890" b="0"/>
+            <wp:extent cx="9715500" cy="6629154"/>
+            <wp:effectExtent l="0" t="0" r="0" b="635"/>
             <wp:wrapNone/>
-            <wp:docPr id="9" name="Imagen 9"/>
+            <wp:docPr id="7" name="Imagen 7"/>
             <wp:cNvGraphicFramePr>
               <a:graphicFrameLocks xmlns:a="http://schemas.openxmlformats.org/drawingml/2006/main" noChangeAspect="1"/>
             </wp:cNvGraphicFramePr>
@@ -1139,306 +1437,6 @@
                     </pic:cNvPicPr>
                   </pic:nvPicPr>
                   <pic:blipFill rotWithShape="1">
-                    <a:blip r:embed="rId9" cstate="print">
-                      <a:extLst>
-                        <a:ext uri="{28A0092B-C50C-407E-A947-70E740481C1C}">
-                          <a14:useLocalDpi xmlns:a14="http://schemas.microsoft.com/office/drawing/2010/main" val="0"/>
-                        </a:ext>
-                      </a:extLst>
-                    </a:blip>
-                    <a:srcRect l="5318" t="5415"/>
-                    <a:stretch/>
-                  </pic:blipFill>
-                  <pic:spPr bwMode="auto">
-                    <a:xfrm>
-                      <a:off x="0" y="0"/>
-                      <a:ext cx="9646471" cy="6396528"/>
-                    </a:xfrm>
-                    <a:prstGeom prst="rect">
-                      <a:avLst/>
-                    </a:prstGeom>
-                    <a:noFill/>
-                    <a:ln>
-                      <a:noFill/>
-                    </a:ln>
-                    <a:extLst>
-                      <a:ext uri="{53640926-AAD7-44D8-BBD7-CCE9431645EC}">
-                        <a14:shadowObscured xmlns:a14="http://schemas.microsoft.com/office/drawing/2010/main"/>
-                      </a:ext>
-                    </a:extLst>
-                  </pic:spPr>
-                </pic:pic>
-              </a:graphicData>
-            </a:graphic>
-            <wp14:sizeRelH relativeFrom="page">
-              <wp14:pctWidth>0</wp14:pctWidth>
-            </wp14:sizeRelH>
-            <wp14:sizeRelV relativeFrom="page">
-              <wp14:pctHeight>0</wp14:pctHeight>
-            </wp14:sizeRelV>
-          </wp:anchor>
-        </w:drawing>
-      </w:r>
-      <w:r>
-        <w:rPr>
-          <w:rFonts w:ascii="Arial" w:hAnsi="Arial" w:cs="Arial"/>
-          <w:b/>
-          <w:bCs/>
-          <w:color w:val="0C3512" w:themeColor="accent3" w:themeShade="80"/>
-        </w:rPr>
-        <w:t>4. Modelo Lógico</w:t>
-      </w:r>
-    </w:p>
-    <w:p>
-      <w:pPr>
-        <w:tabs>
-          <w:tab w:val="left" w:pos="3165"/>
-        </w:tabs>
-        <w:rPr>
-          <w:rFonts w:ascii="Arial" w:hAnsi="Arial" w:cs="Arial"/>
-        </w:rPr>
-      </w:pPr>
-    </w:p>
-    <w:p>
-      <w:pPr>
-        <w:tabs>
-          <w:tab w:val="left" w:pos="3165"/>
-        </w:tabs>
-        <w:rPr>
-          <w:rFonts w:ascii="Arial" w:hAnsi="Arial" w:cs="Arial"/>
-        </w:rPr>
-      </w:pPr>
-    </w:p>
-    <w:p>
-      <w:pPr>
-        <w:tabs>
-          <w:tab w:val="left" w:pos="3165"/>
-        </w:tabs>
-        <w:rPr>
-          <w:rFonts w:ascii="Arial" w:hAnsi="Arial" w:cs="Arial"/>
-        </w:rPr>
-      </w:pPr>
-    </w:p>
-    <w:p>
-      <w:pPr>
-        <w:tabs>
-          <w:tab w:val="left" w:pos="3165"/>
-        </w:tabs>
-        <w:rPr>
-          <w:rFonts w:ascii="Arial" w:hAnsi="Arial" w:cs="Arial"/>
-        </w:rPr>
-      </w:pPr>
-    </w:p>
-    <w:p>
-      <w:pPr>
-        <w:tabs>
-          <w:tab w:val="left" w:pos="3165"/>
-        </w:tabs>
-        <w:rPr>
-          <w:rFonts w:ascii="Arial" w:hAnsi="Arial" w:cs="Arial"/>
-        </w:rPr>
-      </w:pPr>
-    </w:p>
-    <w:p>
-      <w:pPr>
-        <w:tabs>
-          <w:tab w:val="left" w:pos="3165"/>
-        </w:tabs>
-        <w:rPr>
-          <w:rFonts w:ascii="Arial" w:hAnsi="Arial" w:cs="Arial"/>
-        </w:rPr>
-      </w:pPr>
-    </w:p>
-    <w:p>
-      <w:pPr>
-        <w:tabs>
-          <w:tab w:val="left" w:pos="3165"/>
-        </w:tabs>
-        <w:rPr>
-          <w:rFonts w:ascii="Arial" w:hAnsi="Arial" w:cs="Arial"/>
-        </w:rPr>
-      </w:pPr>
-    </w:p>
-    <w:p>
-      <w:pPr>
-        <w:tabs>
-          <w:tab w:val="left" w:pos="3165"/>
-        </w:tabs>
-        <w:rPr>
-          <w:rFonts w:ascii="Arial" w:hAnsi="Arial" w:cs="Arial"/>
-        </w:rPr>
-      </w:pPr>
-    </w:p>
-    <w:p>
-      <w:pPr>
-        <w:tabs>
-          <w:tab w:val="left" w:pos="3165"/>
-        </w:tabs>
-        <w:rPr>
-          <w:rFonts w:ascii="Arial" w:hAnsi="Arial" w:cs="Arial"/>
-        </w:rPr>
-      </w:pPr>
-    </w:p>
-    <w:p>
-      <w:pPr>
-        <w:tabs>
-          <w:tab w:val="left" w:pos="3165"/>
-        </w:tabs>
-        <w:rPr>
-          <w:rFonts w:ascii="Arial" w:hAnsi="Arial" w:cs="Arial"/>
-        </w:rPr>
-      </w:pPr>
-    </w:p>
-    <w:p>
-      <w:pPr>
-        <w:tabs>
-          <w:tab w:val="left" w:pos="3165"/>
-        </w:tabs>
-        <w:rPr>
-          <w:rFonts w:ascii="Arial" w:hAnsi="Arial" w:cs="Arial"/>
-        </w:rPr>
-      </w:pPr>
-    </w:p>
-    <w:p>
-      <w:pPr>
-        <w:tabs>
-          <w:tab w:val="left" w:pos="3165"/>
-        </w:tabs>
-        <w:rPr>
-          <w:rFonts w:ascii="Arial" w:hAnsi="Arial" w:cs="Arial"/>
-        </w:rPr>
-      </w:pPr>
-    </w:p>
-    <w:p>
-      <w:pPr>
-        <w:tabs>
-          <w:tab w:val="left" w:pos="3165"/>
-        </w:tabs>
-        <w:rPr>
-          <w:rFonts w:ascii="Arial" w:hAnsi="Arial" w:cs="Arial"/>
-        </w:rPr>
-      </w:pPr>
-    </w:p>
-    <w:p>
-      <w:pPr>
-        <w:tabs>
-          <w:tab w:val="left" w:pos="3165"/>
-        </w:tabs>
-        <w:rPr>
-          <w:rFonts w:ascii="Arial" w:hAnsi="Arial" w:cs="Arial"/>
-        </w:rPr>
-      </w:pPr>
-    </w:p>
-    <w:p>
-      <w:pPr>
-        <w:tabs>
-          <w:tab w:val="left" w:pos="3165"/>
-        </w:tabs>
-        <w:rPr>
-          <w:rFonts w:ascii="Arial" w:hAnsi="Arial" w:cs="Arial"/>
-        </w:rPr>
-      </w:pPr>
-    </w:p>
-    <w:p>
-      <w:pPr>
-        <w:tabs>
-          <w:tab w:val="left" w:pos="3165"/>
-        </w:tabs>
-        <w:rPr>
-          <w:rFonts w:ascii="Arial" w:hAnsi="Arial" w:cs="Arial"/>
-        </w:rPr>
-      </w:pPr>
-    </w:p>
-    <w:p>
-      <w:pPr>
-        <w:tabs>
-          <w:tab w:val="left" w:pos="3165"/>
-        </w:tabs>
-        <w:rPr>
-          <w:rFonts w:ascii="Arial" w:hAnsi="Arial" w:cs="Arial"/>
-        </w:rPr>
-      </w:pPr>
-    </w:p>
-    <w:p>
-      <w:pPr>
-        <w:tabs>
-          <w:tab w:val="left" w:pos="3165"/>
-        </w:tabs>
-        <w:rPr>
-          <w:rFonts w:ascii="Arial" w:hAnsi="Arial" w:cs="Arial"/>
-        </w:rPr>
-      </w:pPr>
-    </w:p>
-    <w:p>
-      <w:pPr>
-        <w:tabs>
-          <w:tab w:val="left" w:pos="3165"/>
-        </w:tabs>
-        <w:rPr>
-          <w:rFonts w:ascii="Arial" w:hAnsi="Arial" w:cs="Arial"/>
-        </w:rPr>
-      </w:pPr>
-    </w:p>
-    <w:p>
-      <w:pPr>
-        <w:tabs>
-          <w:tab w:val="left" w:pos="3165"/>
-        </w:tabs>
-        <w:rPr>
-          <w:rFonts w:ascii="Arial" w:hAnsi="Arial" w:cs="Arial"/>
-        </w:rPr>
-      </w:pPr>
-    </w:p>
-    <w:p>
-      <w:pPr>
-        <w:tabs>
-          <w:tab w:val="left" w:pos="3165"/>
-        </w:tabs>
-        <w:rPr>
-          <w:rFonts w:ascii="Arial" w:hAnsi="Arial" w:cs="Arial"/>
-        </w:rPr>
-      </w:pPr>
-    </w:p>
-    <w:p>
-      <w:pPr>
-        <w:tabs>
-          <w:tab w:val="left" w:pos="3165"/>
-        </w:tabs>
-        <w:rPr>
-          <w:rFonts w:ascii="Arial" w:hAnsi="Arial" w:cs="Arial"/>
-        </w:rPr>
-      </w:pPr>
-      <w:r>
-        <w:rPr>
-          <w:noProof/>
-        </w:rPr>
-        <w:lastRenderedPageBreak/>
-        <w:drawing>
-          <wp:anchor distT="0" distB="0" distL="114300" distR="114300" simplePos="0" relativeHeight="251674624" behindDoc="0" locked="0" layoutInCell="1" allowOverlap="1" wp14:anchorId="20E70E8B" wp14:editId="721BF49F">
-            <wp:simplePos x="0" y="0"/>
-            <wp:positionH relativeFrom="column">
-              <wp:posOffset>47767</wp:posOffset>
-            </wp:positionH>
-            <wp:positionV relativeFrom="paragraph">
-              <wp:posOffset>268023</wp:posOffset>
-            </wp:positionV>
-            <wp:extent cx="9525133" cy="6316235"/>
-            <wp:effectExtent l="0" t="0" r="0" b="8890"/>
-            <wp:wrapNone/>
-            <wp:docPr id="8" name="Imagen 8"/>
-            <wp:cNvGraphicFramePr>
-              <a:graphicFrameLocks xmlns:a="http://schemas.openxmlformats.org/drawingml/2006/main" noChangeAspect="1"/>
-            </wp:cNvGraphicFramePr>
-            <a:graphic xmlns:a="http://schemas.openxmlformats.org/drawingml/2006/main">
-              <a:graphicData uri="http://schemas.openxmlformats.org/drawingml/2006/picture">
-                <pic:pic xmlns:pic="http://schemas.openxmlformats.org/drawingml/2006/picture">
-                  <pic:nvPicPr>
-                    <pic:cNvPr id="0" name="Picture 2"/>
-                    <pic:cNvPicPr>
-                      <a:picLocks noChangeAspect="1" noChangeArrowheads="1"/>
-                    </pic:cNvPicPr>
-                  </pic:nvPicPr>
-                  <pic:blipFill rotWithShape="1">
                     <a:blip r:embed="rId10" cstate="print">
                       <a:extLst>
                         <a:ext uri="{28A0092B-C50C-407E-A947-70E740481C1C}">
@@ -1446,13 +1444,13 @@
                         </a:ext>
                       </a:extLst>
                     </a:blip>
-                    <a:srcRect l="5858" t="6022"/>
+                    <a:srcRect l="7287" t="7212"/>
                     <a:stretch/>
                   </pic:blipFill>
                   <pic:spPr bwMode="auto">
                     <a:xfrm>
                       <a:off x="0" y="0"/>
-                      <a:ext cx="9525925" cy="6316760"/>
+                      <a:ext cx="9720063" cy="6632267"/>
                     </a:xfrm>
                     <a:prstGeom prst="rect">
                       <a:avLst/>

</xml_diff>